<commit_message>
fixed account order rule changes not taking effect until the in-memory cache expired by evicting it on save
</commit_message>
<xml_diff>
--- a/doc/SOFD Core - User Account Agent.docx
+++ b/doc/SOFD Core - User Account Agent.docx
@@ -145,19 +145,7 @@
         <w:tab/>
       </w:r>
       <w:r>
-        <w:t>2</w:t>
-      </w:r>
-      <w:r>
-        <w:t>.</w:t>
-      </w:r>
-      <w:r>
-        <w:t>4</w:t>
-      </w:r>
-      <w:r>
-        <w:t>.</w:t>
-      </w:r>
-      <w:r>
-        <w:t>0</w:t>
+        <w:t>2.21.0</w:t>
       </w:r>
     </w:p>
     <w:p>
@@ -178,25 +166,7 @@
         <w:tab/>
       </w:r>
       <w:r>
-        <w:t>19</w:t>
-      </w:r>
-      <w:r>
-        <w:t>.</w:t>
-      </w:r>
-      <w:r>
-        <w:t>0</w:t>
-      </w:r>
-      <w:r>
-        <w:t>4</w:t>
-      </w:r>
-      <w:r>
-        <w:t>.20</w:t>
-      </w:r>
-      <w:r>
-        <w:t>2</w:t>
-      </w:r>
-      <w:r>
-        <w:t>2</w:t>
+        <w:t>05.05.2026</w:t>
       </w:r>
     </w:p>
     <w:p>
@@ -1418,7 +1388,7 @@
         <w:rPr>
           <w:lang w:val="da-DK"/>
         </w:rPr>
-        <w:t>.NET Framework 4.6.1</w:t>
+        <w:t>.NET Framework 4.8</w:t>
       </w:r>
       <w:r>
         <w:rPr>
@@ -1699,7 +1669,7 @@
         <w:rPr>
           <w:lang w:val="da-DK"/>
         </w:rPr>
-        <w:t xml:space="preserve">Konfiguration af servicen foretages i appSettings sektionen i xml-filen </w:t>
+        <w:t xml:space="preserve">Konfiguration af servicen foretages i applicationSettings sektionen i xml-filen </w:t>
       </w:r>
       <w:r>
         <w:rPr>
@@ -2490,7 +2460,7 @@
                 <w:bCs w:val="0"/>
                 <w:lang w:val="da-DK"/>
               </w:rPr>
-              <w:t>ExchangeOnlineDomain</w:t>
+              <w:t>ExchangeOnlineMailDomain</w:t>
             </w:r>
           </w:p>
         </w:tc>
@@ -2845,7 +2815,7 @@
                 <w:bCs w:val="0"/>
                 <w:lang w:val="da-DK"/>
               </w:rPr>
-              <w:t>ActiveDirectoryEnableCreation</w:t>
+              <w:t>ActiveDirectoryEnableAccountCreation</w:t>
             </w:r>
           </w:p>
         </w:tc>
@@ -2911,7 +2881,7 @@
                 <w:bCs w:val="0"/>
                 <w:lang w:val="da-DK"/>
               </w:rPr>
-              <w:t>ActiveDirectoryEnableDeactivation</w:t>
+              <w:t>ActiveDirectoryEnableAccountDeactivation</w:t>
             </w:r>
           </w:p>
         </w:tc>
@@ -2977,7 +2947,7 @@
                 <w:bCs w:val="0"/>
                 <w:lang w:val="da-DK"/>
               </w:rPr>
-              <w:t>ActiveDirectoryEnableDeletion</w:t>
+              <w:t>ActiveDirectoryEnableAccountDeletion</w:t>
             </w:r>
           </w:p>
         </w:tc>
@@ -4115,6 +4085,798 @@
                 <w:lang w:val="da-DK"/>
               </w:rPr>
               <w:t>Cron udtryk til afvikling af oprettelse af Exchange konto-ordrer.</w:t>
+            </w:r>
+          </w:p>
+        </w:tc>
+      </w:tr>
+      <w:tr>
+        <w:tc>
+          <w:tcPr>
+            <w:cnfStyle w:val="001000000000" w:firstRow="0" w:lastRow="0" w:firstColumn="1" w:lastColumn="0" w:oddVBand="0" w:evenVBand="0" w:oddHBand="0" w:evenHBand="0" w:firstRowFirstColumn="0" w:firstRowLastColumn="0" w:lastRowFirstColumn="0" w:lastRowLastColumn="0"/>
+            <w:tcW w:w="3823" w:type="dxa"/>
+            <w:shd w:val="clear" w:color="auto" w:fill="auto"/>
+          </w:tcPr>
+          <w:p>
+            <w:pPr>
+              <w:rPr>
+                <w:b w:val="0"/>
+                <w:bCs w:val="0"/>
+                <w:lang w:val="da-DK"/>
+              </w:rPr>
+            </w:pPr>
+            <w:r>
+              <w:rPr>
+                <w:b w:val="0"/>
+                <w:bCs w:val="0"/>
+                <w:lang w:val="da-DK"/>
+              </w:rPr>
+              <w:t>ActiveDirectoryExpirePasswordOnCreate</w:t>
+            </w:r>
+          </w:p>
+        </w:tc>
+        <w:tc>
+          <w:tcPr>
+            <w:tcW w:w="2409" w:type="dxa"/>
+            <w:shd w:val="clear" w:color="auto" w:fill="auto"/>
+          </w:tcPr>
+          <w:p>
+            <w:pPr>
+              <w:cnfStyle w:val="000000000000" w:firstRow="0" w:lastRow="0" w:firstColumn="0" w:lastColumn="0" w:oddVBand="0" w:evenVBand="0" w:oddHBand="0" w:evenHBand="0" w:firstRowFirstColumn="0" w:firstRowLastColumn="0" w:lastRowFirstColumn="0" w:lastRowLastColumn="0"/>
+              <w:rPr>
+                <w:lang w:val="da-DK"/>
+              </w:rPr>
+            </w:pPr>
+            <w:r>
+              <w:rPr>
+                <w:lang w:val="da-DK"/>
+              </w:rPr>
+              <w:t>True</w:t>
+            </w:r>
+          </w:p>
+        </w:tc>
+        <w:tc>
+          <w:tcPr>
+            <w:tcW w:w="3396" w:type="dxa"/>
+            <w:shd w:val="clear" w:color="auto" w:fill="auto"/>
+          </w:tcPr>
+          <w:p>
+            <w:pPr>
+              <w:cnfStyle w:val="000000000000" w:firstRow="0" w:lastRow="0" w:firstColumn="0" w:lastColumn="0" w:oddVBand="0" w:evenVBand="0" w:oddHBand="0" w:evenHBand="0" w:firstRowFirstColumn="0" w:firstRowLastColumn="0" w:lastRowFirstColumn="0" w:lastRowLastColumn="0"/>
+              <w:rPr>
+                <w:lang w:val="da-DK"/>
+              </w:rPr>
+            </w:pPr>
+            <w:r>
+              <w:rPr>
+                <w:lang w:val="da-DK"/>
+              </w:rPr>
+              <w:t>Sættes til "False" hvis brugere ikke skal tvinges til at skifte kodeord ved næste login efter oprettelse af AD konto. Default er "True".</w:t>
+            </w:r>
+          </w:p>
+        </w:tc>
+      </w:tr>
+      <w:tr>
+        <w:tc>
+          <w:tcPr>
+            <w:cnfStyle w:val="001000000000" w:firstRow="0" w:lastRow="0" w:firstColumn="1" w:lastColumn="0" w:oddVBand="0" w:evenVBand="0" w:oddHBand="0" w:evenHBand="0" w:firstRowFirstColumn="0" w:firstRowLastColumn="0" w:lastRowFirstColumn="0" w:lastRowLastColumn="0"/>
+            <w:tcW w:w="3823" w:type="dxa"/>
+            <w:shd w:val="clear" w:color="auto" w:fill="auto"/>
+          </w:tcPr>
+          <w:p>
+            <w:pPr>
+              <w:rPr>
+                <w:b w:val="0"/>
+                <w:bCs w:val="0"/>
+                <w:lang w:val="da-DK"/>
+              </w:rPr>
+            </w:pPr>
+            <w:r>
+              <w:rPr>
+                <w:b w:val="0"/>
+                <w:bCs w:val="0"/>
+                <w:lang w:val="da-DK"/>
+              </w:rPr>
+              <w:t xml:space="preserve">ExchangeOnlyPowershell</w:t>
+            </w:r>
+          </w:p>
+        </w:tc>
+        <w:tc>
+          <w:tcPr>
+            <w:tcW w:w="2409" w:type="dxa"/>
+            <w:shd w:val="clear" w:color="auto" w:fill="auto"/>
+          </w:tcPr>
+          <w:p>
+            <w:pPr>
+              <w:cnfStyle w:val="000000000000" w:firstRow="0" w:lastRow="0" w:firstColumn="0" w:lastColumn="0" w:oddVBand="0" w:evenVBand="0" w:oddHBand="0" w:evenHBand="0" w:firstRowFirstColumn="0" w:firstRowLastColumn="0" w:lastRowFirstColumn="0" w:lastRowLastColumn="0"/>
+              <w:rPr>
+                <w:lang w:val="da-DK"/>
+              </w:rPr>
+            </w:pPr>
+            <w:r>
+              <w:rPr>
+                <w:lang w:val="da-DK"/>
+              </w:rPr>
+              <w:t xml:space="preserve">True</w:t>
+            </w:r>
+          </w:p>
+        </w:tc>
+        <w:tc>
+          <w:tcPr>
+            <w:tcW w:w="3396" w:type="dxa"/>
+            <w:shd w:val="clear" w:color="auto" w:fill="auto"/>
+          </w:tcPr>
+          <w:p>
+            <w:pPr>
+              <w:cnfStyle w:val="000000000000" w:firstRow="0" w:lastRow="0" w:firstColumn="0" w:lastColumn="0" w:oddVBand="0" w:evenVBand="0" w:oddHBand="0" w:evenHBand="0" w:firstRowFirstColumn="0" w:firstRowLastColumn="0" w:lastRowFirstColumn="0" w:lastRowLastColumn="0"/>
+              <w:rPr>
+                <w:lang w:val="da-DK"/>
+              </w:rPr>
+            </w:pPr>
+            <w:r>
+              <w:rPr>
+                <w:lang w:val="da-DK"/>
+              </w:rPr>
+              <w:t xml:space="preserve">Sættes til "True" hvis agenten ikke skal benytte den indbyggede Exchange-integration, men udelukkende afvikle de konfigurerede Exchange powershell scripts.</w:t>
+            </w:r>
+          </w:p>
+        </w:tc>
+      </w:tr>
+      <w:tr>
+        <w:tc>
+          <w:tcPr>
+            <w:cnfStyle w:val="001000000000" w:firstRow="0" w:lastRow="0" w:firstColumn="1" w:lastColumn="0" w:oddVBand="0" w:evenVBand="0" w:oddHBand="0" w:evenHBand="0" w:firstRowFirstColumn="0" w:firstRowLastColumn="0" w:lastRowFirstColumn="0" w:lastRowLastColumn="0"/>
+            <w:tcW w:w="3823" w:type="dxa"/>
+            <w:shd w:val="clear" w:color="auto" w:fill="auto"/>
+          </w:tcPr>
+          <w:p>
+            <w:pPr>
+              <w:rPr>
+                <w:b w:val="0"/>
+                <w:bCs w:val="0"/>
+                <w:lang w:val="da-DK"/>
+              </w:rPr>
+            </w:pPr>
+            <w:r>
+              <w:rPr>
+                <w:b w:val="0"/>
+                <w:bCs w:val="0"/>
+                <w:lang w:val="da-DK"/>
+              </w:rPr>
+              <w:t xml:space="preserve">ActiveDirectoryInitialPassword</w:t>
+            </w:r>
+          </w:p>
+        </w:tc>
+        <w:tc>
+          <w:tcPr>
+            <w:tcW w:w="2409" w:type="dxa"/>
+            <w:shd w:val="clear" w:color="auto" w:fill="auto"/>
+          </w:tcPr>
+          <w:p>
+            <w:pPr>
+              <w:cnfStyle w:val="000000000000" w:firstRow="0" w:lastRow="0" w:firstColumn="0" w:lastColumn="0" w:oddVBand="0" w:evenVBand="0" w:oddHBand="0" w:evenHBand="0" w:firstRowFirstColumn="0" w:firstRowLastColumn="0" w:lastRowFirstColumn="0" w:lastRowLastColumn="0"/>
+              <w:rPr>
+                <w:lang w:val="da-DK"/>
+              </w:rPr>
+            </w:pPr>
+            <w:r>
+              <w:rPr>
+                <w:lang w:val="da-DK"/>
+              </w:rPr>
+              <w:t xml:space="preserve"/>
+            </w:r>
+          </w:p>
+        </w:tc>
+        <w:tc>
+          <w:tcPr>
+            <w:tcW w:w="3396" w:type="dxa"/>
+            <w:shd w:val="clear" w:color="auto" w:fill="auto"/>
+          </w:tcPr>
+          <w:p>
+            <w:pPr>
+              <w:cnfStyle w:val="000000000000" w:firstRow="0" w:lastRow="0" w:firstColumn="0" w:lastColumn="0" w:oddVBand="0" w:evenVBand="0" w:oddHBand="0" w:evenHBand="0" w:firstRowFirstColumn="0" w:firstRowLastColumn="0" w:lastRowFirstColumn="0" w:lastRowLastColumn="0"/>
+              <w:rPr>
+                <w:lang w:val="da-DK"/>
+              </w:rPr>
+            </w:pPr>
+            <w:r>
+              <w:rPr>
+                <w:lang w:val="da-DK"/>
+              </w:rPr>
+              <w:t xml:space="preserve">Det initiale kodeord der sættes på nyoprettede AD konti. Hvis feltet er tomt, genereres et tilfældigt kodeord (GUID).</w:t>
+            </w:r>
+          </w:p>
+        </w:tc>
+      </w:tr>
+      <w:tr>
+        <w:tc>
+          <w:tcPr>
+            <w:cnfStyle w:val="001000000000" w:firstRow="0" w:lastRow="0" w:firstColumn="1" w:lastColumn="0" w:oddVBand="0" w:evenVBand="0" w:oddHBand="0" w:evenHBand="0" w:firstRowFirstColumn="0" w:firstRowLastColumn="0" w:lastRowFirstColumn="0" w:lastRowLastColumn="0"/>
+            <w:tcW w:w="3823" w:type="dxa"/>
+            <w:shd w:val="clear" w:color="auto" w:fill="auto"/>
+          </w:tcPr>
+          <w:p>
+            <w:pPr>
+              <w:rPr>
+                <w:b w:val="0"/>
+                <w:bCs w:val="0"/>
+                <w:lang w:val="da-DK"/>
+              </w:rPr>
+            </w:pPr>
+            <w:r>
+              <w:rPr>
+                <w:b w:val="0"/>
+                <w:bCs w:val="0"/>
+                <w:lang w:val="da-DK"/>
+              </w:rPr>
+              <w:t xml:space="preserve">ActiveDirectoryExpirePowershell</w:t>
+            </w:r>
+          </w:p>
+        </w:tc>
+        <w:tc>
+          <w:tcPr>
+            <w:tcW w:w="2409" w:type="dxa"/>
+            <w:shd w:val="clear" w:color="auto" w:fill="auto"/>
+          </w:tcPr>
+          <w:p>
+            <w:pPr>
+              <w:cnfStyle w:val="000000000000" w:firstRow="0" w:lastRow="0" w:firstColumn="0" w:lastColumn="0" w:oddVBand="0" w:evenVBand="0" w:oddHBand="0" w:evenHBand="0" w:firstRowFirstColumn="0" w:firstRowLastColumn="0" w:lastRowFirstColumn="0" w:lastRowLastColumn="0"/>
+              <w:rPr>
+                <w:lang w:val="da-DK"/>
+              </w:rPr>
+            </w:pPr>
+            <w:r>
+              <w:rPr>
+                <w:lang w:val="da-DK"/>
+              </w:rPr>
+              <w:t xml:space="preserve">ActiveDirectory\expireUser.ps1</w:t>
+            </w:r>
+          </w:p>
+        </w:tc>
+        <w:tc>
+          <w:tcPr>
+            <w:tcW w:w="3396" w:type="dxa"/>
+            <w:shd w:val="clear" w:color="auto" w:fill="auto"/>
+          </w:tcPr>
+          <w:p>
+            <w:pPr>
+              <w:cnfStyle w:val="000000000000" w:firstRow="0" w:lastRow="0" w:firstColumn="0" w:lastColumn="0" w:oddVBand="0" w:evenVBand="0" w:oddHBand="0" w:evenHBand="0" w:firstRowFirstColumn="0" w:firstRowLastColumn="0" w:lastRowFirstColumn="0" w:lastRowLastColumn="0"/>
+              <w:rPr>
+                <w:lang w:val="da-DK"/>
+              </w:rPr>
+            </w:pPr>
+            <w:r>
+              <w:rPr>
+                <w:lang w:val="da-DK"/>
+              </w:rPr>
+              <w:t xml:space="preserve">Stien til det powershell script der skal afvikles når en AD konto sættes til at udløbe (pause-markering). Lad være blank hvis der ikke ønskes afviklet noget powershell.</w:t>
+            </w:r>
+          </w:p>
+        </w:tc>
+      </w:tr>
+      <w:tr>
+        <w:tc>
+          <w:tcPr>
+            <w:cnfStyle w:val="001000000000" w:firstRow="0" w:lastRow="0" w:firstColumn="1" w:lastColumn="0" w:oddVBand="0" w:evenVBand="0" w:oddHBand="0" w:evenHBand="0" w:firstRowFirstColumn="0" w:firstRowLastColumn="0" w:lastRowFirstColumn="0" w:lastRowLastColumn="0"/>
+            <w:tcW w:w="3823" w:type="dxa"/>
+            <w:shd w:val="clear" w:color="auto" w:fill="auto"/>
+          </w:tcPr>
+          <w:p>
+            <w:pPr>
+              <w:rPr>
+                <w:b w:val="0"/>
+                <w:bCs w:val="0"/>
+                <w:lang w:val="da-DK"/>
+              </w:rPr>
+            </w:pPr>
+            <w:r>
+              <w:rPr>
+                <w:b w:val="0"/>
+                <w:bCs w:val="0"/>
+                <w:lang w:val="da-DK"/>
+              </w:rPr>
+              <w:t xml:space="preserve">ActiveDirectoryUserIdGroupings</w:t>
+            </w:r>
+          </w:p>
+        </w:tc>
+        <w:tc>
+          <w:tcPr>
+            <w:tcW w:w="2409" w:type="dxa"/>
+            <w:shd w:val="clear" w:color="auto" w:fill="auto"/>
+          </w:tcPr>
+          <w:p>
+            <w:pPr>
+              <w:cnfStyle w:val="000000000000" w:firstRow="0" w:lastRow="0" w:firstColumn="0" w:lastColumn="0" w:oddVBand="0" w:evenVBand="0" w:oddHBand="0" w:evenHBand="0" w:firstRowFirstColumn="0" w:firstRowLastColumn="0" w:lastRowFirstColumn="0" w:lastRowLastColumn="0"/>
+              <w:rPr>
+                <w:lang w:val="da-DK"/>
+              </w:rPr>
+            </w:pPr>
+            <w:r>
+              <w:rPr>
+                <w:lang w:val="da-DK"/>
+              </w:rPr>
+              <w:t xml:space="preserve"/>
+            </w:r>
+          </w:p>
+        </w:tc>
+        <w:tc>
+          <w:tcPr>
+            <w:tcW w:w="3396" w:type="dxa"/>
+            <w:shd w:val="clear" w:color="auto" w:fill="auto"/>
+          </w:tcPr>
+          <w:p>
+            <w:pPr>
+              <w:cnfStyle w:val="000000000000" w:firstRow="0" w:lastRow="0" w:firstColumn="0" w:lastColumn="0" w:oddVBand="0" w:evenVBand="0" w:oddHBand="0" w:evenHBand="0" w:firstRowFirstColumn="0" w:firstRowLastColumn="0" w:lastRowFirstColumn="0" w:lastRowLastColumn="0"/>
+              <w:rPr>
+                <w:lang w:val="da-DK"/>
+              </w:rPr>
+            </w:pPr>
+            <w:r>
+              <w:rPr>
+                <w:lang w:val="da-DK"/>
+              </w:rPr>
+              <w:t xml:space="preserve">Semikolon-separeret liste af præfikser der anvendes til at gruppere usernames, f.eks. for at adskille interne og eksterne brugere under generering af nye usernames.</w:t>
+            </w:r>
+          </w:p>
+        </w:tc>
+      </w:tr>
+      <w:tr>
+        <w:tc>
+          <w:tcPr>
+            <w:cnfStyle w:val="001000000000" w:firstRow="0" w:lastRow="0" w:firstColumn="1" w:lastColumn="0" w:oddVBand="0" w:evenVBand="0" w:oddHBand="0" w:evenHBand="0" w:firstRowFirstColumn="0" w:firstRowLastColumn="0" w:lastRowFirstColumn="0" w:lastRowLastColumn="0"/>
+            <w:tcW w:w="3823" w:type="dxa"/>
+            <w:shd w:val="clear" w:color="auto" w:fill="auto"/>
+          </w:tcPr>
+          <w:p>
+            <w:pPr>
+              <w:rPr>
+                <w:b w:val="0"/>
+                <w:bCs w:val="0"/>
+                <w:lang w:val="da-DK"/>
+              </w:rPr>
+            </w:pPr>
+            <w:r>
+              <w:rPr>
+                <w:b w:val="0"/>
+                <w:bCs w:val="0"/>
+                <w:lang w:val="da-DK"/>
+              </w:rPr>
+              <w:t xml:space="preserve">ActiveDirectoryFailReactivateOnMultipleDisabled</w:t>
+            </w:r>
+          </w:p>
+        </w:tc>
+        <w:tc>
+          <w:tcPr>
+            <w:tcW w:w="2409" w:type="dxa"/>
+            <w:shd w:val="clear" w:color="auto" w:fill="auto"/>
+          </w:tcPr>
+          <w:p>
+            <w:pPr>
+              <w:cnfStyle w:val="000000000000" w:firstRow="0" w:lastRow="0" w:firstColumn="0" w:lastColumn="0" w:oddVBand="0" w:evenVBand="0" w:oddHBand="0" w:evenHBand="0" w:firstRowFirstColumn="0" w:firstRowLastColumn="0" w:lastRowFirstColumn="0" w:lastRowLastColumn="0"/>
+              <w:rPr>
+                <w:lang w:val="da-DK"/>
+              </w:rPr>
+            </w:pPr>
+            <w:r>
+              <w:rPr>
+                <w:lang w:val="da-DK"/>
+              </w:rPr>
+              <w:t xml:space="preserve">False</w:t>
+            </w:r>
+          </w:p>
+        </w:tc>
+        <w:tc>
+          <w:tcPr>
+            <w:tcW w:w="3396" w:type="dxa"/>
+            <w:shd w:val="clear" w:color="auto" w:fill="auto"/>
+          </w:tcPr>
+          <w:p>
+            <w:pPr>
+              <w:cnfStyle w:val="000000000000" w:firstRow="0" w:lastRow="0" w:firstColumn="0" w:lastColumn="0" w:oddVBand="0" w:evenVBand="0" w:oddHBand="0" w:evenHBand="0" w:firstRowFirstColumn="0" w:firstRowLastColumn="0" w:lastRowFirstColumn="0" w:lastRowLastColumn="0"/>
+              <w:rPr>
+                <w:lang w:val="da-DK"/>
+              </w:rPr>
+            </w:pPr>
+            <w:r>
+              <w:rPr>
+                <w:lang w:val="da-DK"/>
+              </w:rPr>
+              <w:t xml:space="preserve">Sættes til "True" hvis genaktivering af en AD konto skal fejle når der findes flere deaktiverede AD konti med samme CPR-nummer.</w:t>
+            </w:r>
+          </w:p>
+        </w:tc>
+      </w:tr>
+      <w:tr>
+        <w:tc>
+          <w:tcPr>
+            <w:cnfStyle w:val="001000000000" w:firstRow="0" w:lastRow="0" w:firstColumn="1" w:lastColumn="0" w:oddVBand="0" w:evenVBand="0" w:oddHBand="0" w:evenHBand="0" w:firstRowFirstColumn="0" w:firstRowLastColumn="0" w:lastRowFirstColumn="0" w:lastRowLastColumn="0"/>
+            <w:tcW w:w="3823" w:type="dxa"/>
+            <w:shd w:val="clear" w:color="auto" w:fill="auto"/>
+          </w:tcPr>
+          <w:p>
+            <w:pPr>
+              <w:rPr>
+                <w:b w:val="0"/>
+                <w:bCs w:val="0"/>
+                <w:lang w:val="da-DK"/>
+              </w:rPr>
+            </w:pPr>
+            <w:r>
+              <w:rPr>
+                <w:b w:val="0"/>
+                <w:bCs w:val="0"/>
+                <w:lang w:val="da-DK"/>
+              </w:rPr>
+              <w:t xml:space="preserve">IgnoredDCPrefix</w:t>
+            </w:r>
+          </w:p>
+        </w:tc>
+        <w:tc>
+          <w:tcPr>
+            <w:tcW w:w="2409" w:type="dxa"/>
+            <w:shd w:val="clear" w:color="auto" w:fill="auto"/>
+          </w:tcPr>
+          <w:p>
+            <w:pPr>
+              <w:cnfStyle w:val="000000000000" w:firstRow="0" w:lastRow="0" w:firstColumn="0" w:lastColumn="0" w:oddVBand="0" w:evenVBand="0" w:oddHBand="0" w:evenHBand="0" w:firstRowFirstColumn="0" w:firstRowLastColumn="0" w:lastRowFirstColumn="0" w:lastRowLastColumn="0"/>
+              <w:rPr>
+                <w:lang w:val="da-DK"/>
+              </w:rPr>
+            </w:pPr>
+            <w:r>
+              <w:rPr>
+                <w:lang w:val="da-DK"/>
+              </w:rPr>
+              <w:t xml:space="preserve"/>
+            </w:r>
+          </w:p>
+        </w:tc>
+        <w:tc>
+          <w:tcPr>
+            <w:tcW w:w="3396" w:type="dxa"/>
+            <w:shd w:val="clear" w:color="auto" w:fill="auto"/>
+          </w:tcPr>
+          <w:p>
+            <w:pPr>
+              <w:cnfStyle w:val="000000000000" w:firstRow="0" w:lastRow="0" w:firstColumn="0" w:lastColumn="0" w:oddVBand="0" w:evenVBand="0" w:oddHBand="0" w:evenHBand="0" w:firstRowFirstColumn="0" w:firstRowLastColumn="0" w:lastRowFirstColumn="0" w:lastRowLastColumn="0"/>
+              <w:rPr>
+                <w:lang w:val="da-DK"/>
+              </w:rPr>
+            </w:pPr>
+            <w:r>
+              <w:rPr>
+                <w:lang w:val="da-DK"/>
+              </w:rPr>
+              <w:t xml:space="preserve">Præfiks der anvendes til at filtrere domain controllers fra. Domain controllers hvis navn starter med dette præfiks ignoreres ved discovery.</w:t>
+            </w:r>
+          </w:p>
+        </w:tc>
+      </w:tr>
+      <w:tr>
+        <w:tc>
+          <w:tcPr>
+            <w:cnfStyle w:val="001000000000" w:firstRow="0" w:lastRow="0" w:firstColumn="1" w:lastColumn="0" w:oddVBand="0" w:evenVBand="0" w:oddHBand="0" w:evenHBand="0" w:firstRowFirstColumn="0" w:firstRowLastColumn="0" w:lastRowFirstColumn="0" w:lastRowLastColumn="0"/>
+            <w:tcW w:w="3823" w:type="dxa"/>
+            <w:shd w:val="clear" w:color="auto" w:fill="auto"/>
+          </w:tcPr>
+          <w:p>
+            <w:pPr>
+              <w:rPr>
+                <w:b w:val="0"/>
+                <w:bCs w:val="0"/>
+                <w:lang w:val="da-DK"/>
+              </w:rPr>
+            </w:pPr>
+            <w:r>
+              <w:rPr>
+                <w:b w:val="0"/>
+                <w:bCs w:val="0"/>
+                <w:lang w:val="da-DK"/>
+              </w:rPr>
+              <w:t xml:space="preserve">CyberArkEnabled</w:t>
+            </w:r>
+          </w:p>
+        </w:tc>
+        <w:tc>
+          <w:tcPr>
+            <w:tcW w:w="2409" w:type="dxa"/>
+            <w:shd w:val="clear" w:color="auto" w:fill="auto"/>
+          </w:tcPr>
+          <w:p>
+            <w:pPr>
+              <w:cnfStyle w:val="000000000000" w:firstRow="0" w:lastRow="0" w:firstColumn="0" w:lastColumn="0" w:oddVBand="0" w:evenVBand="0" w:oddHBand="0" w:evenHBand="0" w:firstRowFirstColumn="0" w:firstRowLastColumn="0" w:lastRowFirstColumn="0" w:lastRowLastColumn="0"/>
+              <w:rPr>
+                <w:lang w:val="da-DK"/>
+              </w:rPr>
+            </w:pPr>
+            <w:r>
+              <w:rPr>
+                <w:lang w:val="da-DK"/>
+              </w:rPr>
+              <w:t xml:space="preserve">False</w:t>
+            </w:r>
+          </w:p>
+        </w:tc>
+        <w:tc>
+          <w:tcPr>
+            <w:tcW w:w="3396" w:type="dxa"/>
+            <w:shd w:val="clear" w:color="auto" w:fill="auto"/>
+          </w:tcPr>
+          <w:p>
+            <w:pPr>
+              <w:cnfStyle w:val="000000000000" w:firstRow="0" w:lastRow="0" w:firstColumn="0" w:lastColumn="0" w:oddVBand="0" w:evenVBand="0" w:oddHBand="0" w:evenHBand="0" w:firstRowFirstColumn="0" w:firstRowLastColumn="0" w:lastRowFirstColumn="0" w:lastRowLastColumn="0"/>
+              <w:rPr>
+                <w:lang w:val="da-DK"/>
+              </w:rPr>
+            </w:pPr>
+            <w:r>
+              <w:rPr>
+                <w:lang w:val="da-DK"/>
+              </w:rPr>
+              <w:t xml:space="preserve">Sættes til "True" for at hente SOFD API-nøglen fra CyberArk i stedet for direkte fra SofdApiKey.</w:t>
+            </w:r>
+          </w:p>
+        </w:tc>
+      </w:tr>
+      <w:tr>
+        <w:tc>
+          <w:tcPr>
+            <w:cnfStyle w:val="001000000000" w:firstRow="0" w:lastRow="0" w:firstColumn="1" w:lastColumn="0" w:oddVBand="0" w:evenVBand="0" w:oddHBand="0" w:evenHBand="0" w:firstRowFirstColumn="0" w:firstRowLastColumn="0" w:lastRowFirstColumn="0" w:lastRowLastColumn="0"/>
+            <w:tcW w:w="3823" w:type="dxa"/>
+            <w:shd w:val="clear" w:color="auto" w:fill="auto"/>
+          </w:tcPr>
+          <w:p>
+            <w:pPr>
+              <w:rPr>
+                <w:b w:val="0"/>
+                <w:bCs w:val="0"/>
+                <w:lang w:val="da-DK"/>
+              </w:rPr>
+            </w:pPr>
+            <w:r>
+              <w:rPr>
+                <w:b w:val="0"/>
+                <w:bCs w:val="0"/>
+                <w:lang w:val="da-DK"/>
+              </w:rPr>
+              <w:t xml:space="preserve">CyberArkAPI</w:t>
+            </w:r>
+          </w:p>
+        </w:tc>
+        <w:tc>
+          <w:tcPr>
+            <w:tcW w:w="2409" w:type="dxa"/>
+            <w:shd w:val="clear" w:color="auto" w:fill="auto"/>
+          </w:tcPr>
+          <w:p>
+            <w:pPr>
+              <w:cnfStyle w:val="000000000000" w:firstRow="0" w:lastRow="0" w:firstColumn="0" w:lastColumn="0" w:oddVBand="0" w:evenVBand="0" w:oddHBand="0" w:evenHBand="0" w:firstRowFirstColumn="0" w:firstRowLastColumn="0" w:lastRowFirstColumn="0" w:lastRowLastColumn="0"/>
+              <w:rPr>
+                <w:lang w:val="da-DK"/>
+              </w:rPr>
+            </w:pPr>
+            <w:r>
+              <w:rPr>
+                <w:lang w:val="da-DK"/>
+              </w:rPr>
+              <w:t xml:space="preserve">https://cyberark.kommune.dk</w:t>
+            </w:r>
+          </w:p>
+        </w:tc>
+        <w:tc>
+          <w:tcPr>
+            <w:tcW w:w="3396" w:type="dxa"/>
+            <w:shd w:val="clear" w:color="auto" w:fill="auto"/>
+          </w:tcPr>
+          <w:p>
+            <w:pPr>
+              <w:cnfStyle w:val="000000000000" w:firstRow="0" w:lastRow="0" w:firstColumn="0" w:lastColumn="0" w:oddVBand="0" w:evenVBand="0" w:oddHBand="0" w:evenHBand="0" w:firstRowFirstColumn="0" w:firstRowLastColumn="0" w:lastRowFirstColumn="0" w:lastRowLastColumn="0"/>
+              <w:rPr>
+                <w:lang w:val="da-DK"/>
+              </w:rPr>
+            </w:pPr>
+            <w:r>
+              <w:rPr>
+                <w:lang w:val="da-DK"/>
+              </w:rPr>
+              <w:t xml:space="preserve">URL'en til kommunens CyberArk Web Service (CCP/AIM). Anvendes når CyberArkEnabled er "True".</w:t>
+            </w:r>
+          </w:p>
+        </w:tc>
+      </w:tr>
+      <w:tr>
+        <w:tc>
+          <w:tcPr>
+            <w:cnfStyle w:val="001000000000" w:firstRow="0" w:lastRow="0" w:firstColumn="1" w:lastColumn="0" w:oddVBand="0" w:evenVBand="0" w:oddHBand="0" w:evenHBand="0" w:firstRowFirstColumn="0" w:firstRowLastColumn="0" w:lastRowFirstColumn="0" w:lastRowLastColumn="0"/>
+            <w:tcW w:w="3823" w:type="dxa"/>
+            <w:shd w:val="clear" w:color="auto" w:fill="auto"/>
+          </w:tcPr>
+          <w:p>
+            <w:pPr>
+              <w:rPr>
+                <w:b w:val="0"/>
+                <w:bCs w:val="0"/>
+                <w:lang w:val="da-DK"/>
+              </w:rPr>
+            </w:pPr>
+            <w:r>
+              <w:rPr>
+                <w:b w:val="0"/>
+                <w:bCs w:val="0"/>
+                <w:lang w:val="da-DK"/>
+              </w:rPr>
+              <w:t xml:space="preserve">CyberArkAppId</w:t>
+            </w:r>
+          </w:p>
+        </w:tc>
+        <w:tc>
+          <w:tcPr>
+            <w:tcW w:w="2409" w:type="dxa"/>
+            <w:shd w:val="clear" w:color="auto" w:fill="auto"/>
+          </w:tcPr>
+          <w:p>
+            <w:pPr>
+              <w:cnfStyle w:val="000000000000" w:firstRow="0" w:lastRow="0" w:firstColumn="0" w:lastColumn="0" w:oddVBand="0" w:evenVBand="0" w:oddHBand="0" w:evenHBand="0" w:firstRowFirstColumn="0" w:firstRowLastColumn="0" w:lastRowFirstColumn="0" w:lastRowLastColumn="0"/>
+              <w:rPr>
+                <w:lang w:val="da-DK"/>
+              </w:rPr>
+            </w:pPr>
+            <w:r>
+              <w:rPr>
+                <w:lang w:val="da-DK"/>
+              </w:rPr>
+              <w:t xml:space="preserve">SOFDCore</w:t>
+            </w:r>
+          </w:p>
+        </w:tc>
+        <w:tc>
+          <w:tcPr>
+            <w:tcW w:w="3396" w:type="dxa"/>
+            <w:shd w:val="clear" w:color="auto" w:fill="auto"/>
+          </w:tcPr>
+          <w:p>
+            <w:pPr>
+              <w:cnfStyle w:val="000000000000" w:firstRow="0" w:lastRow="0" w:firstColumn="0" w:lastColumn="0" w:oddVBand="0" w:evenVBand="0" w:oddHBand="0" w:evenHBand="0" w:firstRowFirstColumn="0" w:firstRowLastColumn="0" w:lastRowFirstColumn="0" w:lastRowLastColumn="0"/>
+              <w:rPr>
+                <w:lang w:val="da-DK"/>
+              </w:rPr>
+            </w:pPr>
+            <w:r>
+              <w:rPr>
+                <w:lang w:val="da-DK"/>
+              </w:rPr>
+              <w:t xml:space="preserve">App ID i CyberArk der anvendes ved opslag af SOFD API-nøglen.</w:t>
+            </w:r>
+          </w:p>
+        </w:tc>
+      </w:tr>
+      <w:tr>
+        <w:tc>
+          <w:tcPr>
+            <w:cnfStyle w:val="001000000000" w:firstRow="0" w:lastRow="0" w:firstColumn="1" w:lastColumn="0" w:oddVBand="0" w:evenVBand="0" w:oddHBand="0" w:evenHBand="0" w:firstRowFirstColumn="0" w:firstRowLastColumn="0" w:lastRowFirstColumn="0" w:lastRowLastColumn="0"/>
+            <w:tcW w:w="3823" w:type="dxa"/>
+            <w:shd w:val="clear" w:color="auto" w:fill="auto"/>
+          </w:tcPr>
+          <w:p>
+            <w:pPr>
+              <w:rPr>
+                <w:b w:val="0"/>
+                <w:bCs w:val="0"/>
+                <w:lang w:val="da-DK"/>
+              </w:rPr>
+            </w:pPr>
+            <w:r>
+              <w:rPr>
+                <w:b w:val="0"/>
+                <w:bCs w:val="0"/>
+                <w:lang w:val="da-DK"/>
+              </w:rPr>
+              <w:t xml:space="preserve">CyberArkSafe</w:t>
+            </w:r>
+          </w:p>
+        </w:tc>
+        <w:tc>
+          <w:tcPr>
+            <w:tcW w:w="2409" w:type="dxa"/>
+            <w:shd w:val="clear" w:color="auto" w:fill="auto"/>
+          </w:tcPr>
+          <w:p>
+            <w:pPr>
+              <w:cnfStyle w:val="000000000000" w:firstRow="0" w:lastRow="0" w:firstColumn="0" w:lastColumn="0" w:oddVBand="0" w:evenVBand="0" w:oddHBand="0" w:evenHBand="0" w:firstRowFirstColumn="0" w:firstRowLastColumn="0" w:lastRowFirstColumn="0" w:lastRowLastColumn="0"/>
+              <w:rPr>
+                <w:lang w:val="da-DK"/>
+              </w:rPr>
+            </w:pPr>
+            <w:r>
+              <w:rPr>
+                <w:lang w:val="da-DK"/>
+              </w:rPr>
+              <w:t xml:space="preserve">SOFD</w:t>
+            </w:r>
+          </w:p>
+        </w:tc>
+        <w:tc>
+          <w:tcPr>
+            <w:tcW w:w="3396" w:type="dxa"/>
+            <w:shd w:val="clear" w:color="auto" w:fill="auto"/>
+          </w:tcPr>
+          <w:p>
+            <w:pPr>
+              <w:cnfStyle w:val="000000000000" w:firstRow="0" w:lastRow="0" w:firstColumn="0" w:lastColumn="0" w:oddVBand="0" w:evenVBand="0" w:oddHBand="0" w:evenHBand="0" w:firstRowFirstColumn="0" w:firstRowLastColumn="0" w:lastRowFirstColumn="0" w:lastRowLastColumn="0"/>
+              <w:rPr>
+                <w:lang w:val="da-DK"/>
+              </w:rPr>
+            </w:pPr>
+            <w:r>
+              <w:rPr>
+                <w:lang w:val="da-DK"/>
+              </w:rPr>
+              <w:t xml:space="preserve">Navnet på den safe i CyberArk hvor SOFD API-nøglen er gemt.</w:t>
+            </w:r>
+          </w:p>
+        </w:tc>
+      </w:tr>
+      <w:tr>
+        <w:tc>
+          <w:tcPr>
+            <w:cnfStyle w:val="001000000000" w:firstRow="0" w:lastRow="0" w:firstColumn="1" w:lastColumn="0" w:oddVBand="0" w:evenVBand="0" w:oddHBand="0" w:evenHBand="0" w:firstRowFirstColumn="0" w:firstRowLastColumn="0" w:lastRowFirstColumn="0" w:lastRowLastColumn="0"/>
+            <w:tcW w:w="3823" w:type="dxa"/>
+            <w:shd w:val="clear" w:color="auto" w:fill="auto"/>
+          </w:tcPr>
+          <w:p>
+            <w:pPr>
+              <w:rPr>
+                <w:b w:val="0"/>
+                <w:bCs w:val="0"/>
+                <w:lang w:val="da-DK"/>
+              </w:rPr>
+            </w:pPr>
+            <w:r>
+              <w:rPr>
+                <w:b w:val="0"/>
+                <w:bCs w:val="0"/>
+                <w:lang w:val="da-DK"/>
+              </w:rPr>
+              <w:t xml:space="preserve">CyberArkObject</w:t>
+            </w:r>
+          </w:p>
+        </w:tc>
+        <w:tc>
+          <w:tcPr>
+            <w:tcW w:w="2409" w:type="dxa"/>
+            <w:shd w:val="clear" w:color="auto" w:fill="auto"/>
+          </w:tcPr>
+          <w:p>
+            <w:pPr>
+              <w:cnfStyle w:val="000000000000" w:firstRow="0" w:lastRow="0" w:firstColumn="0" w:lastColumn="0" w:oddVBand="0" w:evenVBand="0" w:oddHBand="0" w:evenHBand="0" w:firstRowFirstColumn="0" w:firstRowLastColumn="0" w:lastRowFirstColumn="0" w:lastRowLastColumn="0"/>
+              <w:rPr>
+                <w:lang w:val="da-DK"/>
+              </w:rPr>
+            </w:pPr>
+            <w:r>
+              <w:rPr>
+                <w:lang w:val="da-DK"/>
+              </w:rPr>
+              <w:t xml:space="preserve">SofdApiKey</w:t>
+            </w:r>
+          </w:p>
+        </w:tc>
+        <w:tc>
+          <w:tcPr>
+            <w:tcW w:w="3396" w:type="dxa"/>
+            <w:shd w:val="clear" w:color="auto" w:fill="auto"/>
+          </w:tcPr>
+          <w:p>
+            <w:pPr>
+              <w:cnfStyle w:val="000000000000" w:firstRow="0" w:lastRow="0" w:firstColumn="0" w:lastColumn="0" w:oddVBand="0" w:evenVBand="0" w:oddHBand="0" w:evenHBand="0" w:firstRowFirstColumn="0" w:firstRowLastColumn="0" w:lastRowFirstColumn="0" w:lastRowLastColumn="0"/>
+              <w:rPr>
+                <w:lang w:val="da-DK"/>
+              </w:rPr>
+            </w:pPr>
+            <w:r>
+              <w:rPr>
+                <w:lang w:val="da-DK"/>
+              </w:rPr>
+              <w:t xml:space="preserve">Navnet på det objekt i CyberArk safen der indeholder SOFD API-nøglen.</w:t>
             </w:r>
           </w:p>
         </w:tc>
@@ -5233,7 +5995,7 @@
         <w:rPr>
           <w:lang w:val="da-DK"/>
         </w:rPr>
-        <w:t>Der skal være en funktion i scriptet der hedder ”Invoke-Method”, som tager 3 argumenter, hhv</w:t>
+        <w:t>Der skal være en funktion i scriptet der hedder ”Invoke-Method”, som tager 3 obligatoriske argumenter, hhv</w:t>
       </w:r>
     </w:p>
     <w:p>
@@ -5314,6 +6076,19 @@
           <w:lang w:val="da-DK"/>
         </w:rPr>
         <w:t>Der følger 3 eksempel-scripts med når man installerer servicen, som man kan rette i. De er alle ens, og skriver blot hændelsen til en logfil.</w:t>
+      </w:r>
+    </w:p>
+    <w:p>
+      <w:pPr>
+        <w:rPr>
+          <w:lang w:val="da-DK"/>
+        </w:rPr>
+      </w:pPr>
+      <w:r>
+        <w:rPr>
+          <w:lang w:val="da-DK"/>
+        </w:rPr>
+        <w:t xml:space="preserve">Agenten sender derudover et antal valgfrie navngivne parametre når disse er tilgængelige: EmailAlias (alias for nye Exchange-konti), DC (domain controller), OptionalJson (kontekstdata fra ordren), Date (udløbsdato ved expire-bestillinger) og OrderedBy (id på den administrator der har bestilt handlingen). Disse kan tilføjes til Invoke-Method-funktionen som ekstra param-argumenter, hvis scriptet skal bruge dem.</w:t>
       </w:r>
     </w:p>
     <w:p>

</xml_diff>